<commit_message>
forms: campo separado e obrigatorio de numero de WhatsApp (assistente separado; universal com DDD/pais)
</commit_message>
<xml_diff>
--- a/onboarding/onboarding-academias.docx
+++ b/onboarding/onboarding-academias.docx
@@ -221,7 +221,7 @@
           <w:color w:val="1A1A17"/>
           <w:sz w:val="22"/>
         </w:rPr>
-        <w:t>4. Qual número de WhatsApp vai receber as mensagens?</w:t>
+        <w:t>4. Qual número de WhatsApp vai receber as mensagens? (com DDD e país)</w:t>
       </w:r>
     </w:p>
     <w:p>
@@ -236,7 +236,7 @@
           <w:color w:val="7A7A72"/>
           <w:sz w:val="19"/>
         </w:rPr>
-        <w:t>É o número atual da empresa ou vão criar um novo?</w:t>
+        <w:t>Ex.: +55 11 99999-9999. É o número onde o agente vai funcionar — pode ser o atual da empresa ou um novo. Importante informar o número completo.</w:t>
       </w:r>
     </w:p>
     <w:p>

</xml_diff>